<commit_message>
Agregado archivo howToUseIt, guía de tips financieros y versión v23
</commit_message>
<xml_diff>
--- a/docs/La_Fructosa_Manual_de_Uso.docx
+++ b/docs/La_Fructosa_Manual_de_Uso.docx
@@ -68,7 +68,7 @@
           <w:color w:val="5B6B88"/>
           <w:sz w:val="22"/>
         </w:rPr>
-        <w:t>Versión 3.1 · octubre de 2026</w:t>
+        <w:t>Versión 3.2 (v23) · octubre de 2026</w:t>
       </w:r>
     </w:p>
     <w:p>
@@ -254,7 +254,35 @@
         <w:spacing w:after="40"/>
       </w:pPr>
       <w:r>
-        <w:t>20. Preguntas frecuentes</w:t>
+        <w:rPr/>
+        <w:t>20. Conciliación semanal</w:t>
+      </w:r>
+    </w:p>
+    <w:p>
+      <w:pPr>
+        <w:spacing w:after="40"/>
+      </w:pPr>
+      <w:r>
+        <w:rPr/>
+        <w:t>21. Exportar tus datos: Excel y CSV</w:t>
+      </w:r>
+    </w:p>
+    <w:p>
+      <w:pPr>
+        <w:spacing w:after="40"/>
+      </w:pPr>
+      <w:r>
+        <w:rPr/>
+        <w:t>22. Guía de finanzas personales</w:t>
+      </w:r>
+    </w:p>
+    <w:p>
+      <w:pPr>
+        <w:spacing w:after="40"/>
+      </w:pPr>
+      <w:r>
+        <w:rPr/>
+        <w:t>23. Preguntas frecuentes</w:t>
       </w:r>
     </w:p>
     <w:p>
@@ -815,6 +843,121 @@
       </w:pPr>
       <w:r>
         <w:t>Una cuenta es cualquier lugar donde guardas dinero: la cartera, tu banco, Zelle, Pago Móvil, Binance. Créala una vez con lo que tienes hoy y la app suma y resta por ti. Puedes archivar las que ya no uses sin perder su historial.</w:t>
+      </w:r>
+    </w:p>
+    <w:p>
+      <w:pPr>
+        <w:spacing w:after="60"/>
+        <w:ind w:left="510" w:hanging="283"/>
+      </w:pPr>
+      <w:r>
+        <w:rPr>
+          <w:b/>
+          <w:color w:val="3E63B8"/>
+        </w:rPr>
+        <w:t xml:space="preserve">1.  </w:t>
+      </w:r>
+      <w:r>
+        <w:rPr/>
+        <w:t>Entra a Más › Cuentas y toca "+ Nueva" (la primera vez, la bienvenida te ofrece crearlas de una vez).</w:t>
+      </w:r>
+    </w:p>
+    <w:p>
+      <w:pPr>
+        <w:spacing w:after="60"/>
+        <w:ind w:left="510" w:hanging="283"/>
+      </w:pPr>
+      <w:r>
+        <w:rPr>
+          <w:b/>
+          <w:color w:val="3E63B8"/>
+        </w:rPr>
+        <w:t xml:space="preserve">2.  </w:t>
+      </w:r>
+      <w:r>
+        <w:rPr/>
+        <w:t>Usa una plantilla rápida (Pago Móvil, Zelle, Efectivo USD, Binance…) o arma la tuya.</w:t>
+      </w:r>
+    </w:p>
+    <w:p>
+      <w:pPr>
+        <w:spacing w:after="60"/>
+        <w:ind w:left="510" w:hanging="283"/>
+      </w:pPr>
+      <w:r>
+        <w:rPr>
+          <w:b/>
+          <w:color w:val="3E63B8"/>
+        </w:rPr>
+        <w:t xml:space="preserve">3.  </w:t>
+      </w:r>
+      <w:r>
+        <w:rPr/>
+        <w:t>Elige la moneda (USD, VES, USDT o EUR) y el tipo (Efectivo, Banco, Digital o Cripto).</w:t>
+      </w:r>
+    </w:p>
+    <w:p>
+      <w:pPr>
+        <w:spacing w:after="60"/>
+        <w:ind w:left="510" w:hanging="283"/>
+      </w:pPr>
+      <w:r>
+        <w:rPr>
+          <w:b/>
+          <w:color w:val="3E63B8"/>
+        </w:rPr>
+        <w:t xml:space="preserve">4.  </w:t>
+      </w:r>
+      <w:r>
+        <w:rPr/>
+        <w:t>Escribe el nombre. Si es tipo Banco, la app te sugiere bancos según la moneda: en bolívares, la lista completa de bancos venezolanos (BDV, Banesco, Mercantil, Provincial, BNC, Bancamiga, Tesoro, Bancaribe, Exterior, Banplus, BFC, Activo, Plaza, Sofitasa, 100% Banco, DelSur, Bancrecer, R4, Banfanb y los demás); en dólares, euros o USDT, bancos internacionales, apps de pago (Zelle, PayPal, Wise, Zinli, Wally, Airtm…) y cripto (Binance, Bybit, OKX…). Si el tuyo no aparece, escríbelo.</w:t>
+      </w:r>
+    </w:p>
+    <w:p>
+      <w:pPr>
+        <w:spacing w:after="60"/>
+        <w:ind w:left="510" w:hanging="283"/>
+      </w:pPr>
+      <w:r>
+        <w:rPr>
+          <w:b/>
+          <w:color w:val="3E63B8"/>
+        </w:rPr>
+        <w:t xml:space="preserve">5.  </w:t>
+      </w:r>
+      <w:r>
+        <w:rPr/>
+        <w:t>Escribe el saldo que tienes hoy (puede ser 0) y toca "Crear cuenta". Desde ahí la app suma y resta sola con cada movimiento.</w:t>
+      </w:r>
+    </w:p>
+    <w:p>
+      <w:pPr>
+        <w:pStyle w:val="ListBullet"/>
+        <w:spacing w:after="60"/>
+      </w:pPr>
+      <w:r>
+        <w:rPr/>
+        <w:t>Archiva las cuentas que ya no uses: desaparecen de la lista pero su historial se conserva.</w:t>
+      </w:r>
+    </w:p>
+    <w:p>
+      <w:pPr>
+        <w:pStyle w:val="ListBullet"/>
+        <w:spacing w:after="60"/>
+      </w:pPr>
+      <w:r>
+        <w:rPr/>
+        <w:t>Vives fuera de Venezuela: elige tu país (o "Otro país") en Ajustes. Si conservas una cuenta en bolívares, créala igual: las tasas BCV, Paralelo y USDT se activan solas.</w:t>
+      </w:r>
+    </w:p>
+    <w:p>
+      <w:pPr>
+        <w:pStyle w:val="ListBullet"/>
+        <w:spacing w:after="60"/>
+      </w:pPr>
+      <w:r>
+        <w:rPr/>
+        <w:t>En el inicio ves el patrimonio total de todas tus cuentas convertido a la moneda que prefieras (USD, Bs. o EUR).</w:t>
       </w:r>
     </w:p>
     <w:tbl>
@@ -1850,6 +1993,69 @@
         <w:spacing w:after="60"/>
       </w:pPr>
       <w:r>
+        <w:rPr>
+          <w:b/>
+        </w:rPr>
+        <w:t>Texto libre:</w:t>
+      </w:r>
+      <w:r>
+        <w:rPr/>
+        <w:t xml:space="preserve"> escribe como hablas, por ejemplo "gasté 12 dólares en el mercado con Zelle" o "me pagaron 300 de sueldo en Banesco".</w:t>
+      </w:r>
+    </w:p>
+    <w:p>
+      <w:pPr>
+        <w:pStyle w:val="ListBullet"/>
+        <w:spacing w:after="60"/>
+      </w:pPr>
+      <w:r>
+        <w:rPr>
+          <w:b/>
+        </w:rPr>
+        <w:t>Nota de voz:</w:t>
+      </w:r>
+      <w:r>
+        <w:rPr/>
+        <w:t xml:space="preserve"> toca el micrófono 🎙️ y dilo en voz alta. Lo que dices se escribe en tiempo real; cuando termines, toca enviar.</w:t>
+      </w:r>
+    </w:p>
+    <w:p>
+      <w:pPr>
+        <w:pStyle w:val="ListBullet"/>
+        <w:spacing w:after="60"/>
+      </w:pPr>
+      <w:r>
+        <w:rPr>
+          <w:b/>
+        </w:rPr>
+        <w:t>Captura o foto:</w:t>
+      </w:r>
+      <w:r>
+        <w:rPr/>
+        <w:t xml:space="preserve"> toca la cámara 📷 y elige la captura del comprobante (Pago Móvil, transferencia, Zelle, Binance, PayPal, Zinli, una factura o un ticket).</w:t>
+      </w:r>
+    </w:p>
+    <w:p>
+      <w:pPr>
+        <w:pStyle w:val="ListBullet"/>
+        <w:spacing w:after="60"/>
+      </w:pPr>
+      <w:r>
+        <w:rPr>
+          <w:b/>
+        </w:rPr>
+      </w:r>
+      <w:r>
+        <w:rPr/>
+        <w:t>Fructosa te muestra el movimiento listo: monto, moneda, fecha, cuenta y categoría. Revísalo y toca "Registrar", o "Descartar" si algo no cuadra.</w:t>
+      </w:r>
+    </w:p>
+    <w:p>
+      <w:pPr>
+        <w:pStyle w:val="ListBullet"/>
+        <w:spacing w:after="60"/>
+      </w:pPr>
+      <w:r>
         <w:t>"¿Cuánto tengo en total?"</w:t>
       </w:r>
     </w:p>
@@ -2477,10 +2683,92 @@
         <w:rPr>
           <w:b/>
         </w:rPr>
-        <w:t xml:space="preserve">iPhone (Safari): </w:t>
+        <w:t>iPhone (Safari):</w:t>
+      </w:r>
+    </w:p>
+    <w:p>
+      <w:pPr>
+        <w:spacing w:after="60"/>
+        <w:ind w:left="510" w:hanging="283"/>
+      </w:pPr>
+      <w:r>
+        <w:rPr>
+          <w:b/>
+          <w:color w:val="3E63B8"/>
+        </w:rPr>
+        <w:t xml:space="preserve">1.  </w:t>
       </w:r>
       <w:r>
-        <w:t>abre la app, toca Compartir y luego "Agregar a inicio".</w:t>
+        <w:rPr/>
+        <w:t>Copia el enlace https://lfzv98.github.io/la-fructosa/ y ábrelo en Safari.</w:t>
+      </w:r>
+    </w:p>
+    <w:p>
+      <w:pPr>
+        <w:spacing w:after="60"/>
+        <w:ind w:left="510" w:hanging="283"/>
+      </w:pPr>
+      <w:r>
+        <w:rPr>
+          <w:b/>
+          <w:color w:val="3E63B8"/>
+        </w:rPr>
+        <w:t xml:space="preserve">2.  </w:t>
+      </w:r>
+      <w:r>
+        <w:rPr/>
+        <w:t>Toca el botón de Opciones o Compartir (los 3 puntos ••• o el ícono de compartir, abajo a la derecha).</w:t>
+      </w:r>
+    </w:p>
+    <w:p>
+      <w:pPr>
+        <w:spacing w:after="60"/>
+        <w:ind w:left="510" w:hanging="283"/>
+      </w:pPr>
+      <w:r>
+        <w:rPr>
+          <w:b/>
+          <w:color w:val="3E63B8"/>
+        </w:rPr>
+        <w:t xml:space="preserve">3.  </w:t>
+      </w:r>
+      <w:r>
+        <w:rPr/>
+        <w:t>Selecciona "Compartir" (Share).</w:t>
+      </w:r>
+    </w:p>
+    <w:p>
+      <w:pPr>
+        <w:spacing w:after="60"/>
+        <w:ind w:left="510" w:hanging="283"/>
+      </w:pPr>
+      <w:r>
+        <w:rPr>
+          <w:b/>
+          <w:color w:val="3E63B8"/>
+        </w:rPr>
+        <w:t xml:space="preserve">4.  </w:t>
+      </w:r>
+      <w:r>
+        <w:rPr/>
+        <w:t>Toca "Ver más" (View More) si no aparece a primera vista.</w:t>
+      </w:r>
+    </w:p>
+    <w:p>
+      <w:pPr>
+        <w:spacing w:after="60"/>
+        <w:ind w:left="510" w:hanging="283"/>
+      </w:pPr>
+      <w:r>
+        <w:rPr>
+          <w:b/>
+          <w:color w:val="3E63B8"/>
+        </w:rPr>
+        <w:t xml:space="preserve">5.  </w:t>
+      </w:r>
+      <w:r>
+        <w:rPr/>
+        <w:t>Presiona "Agregar a la pantalla de inicio" (Add to Home Screen) y luego "Agregar".</w:t>
       </w:r>
     </w:p>
     <w:p>
@@ -2495,7 +2783,8 @@
         <w:t xml:space="preserve">Android (Chrome): </w:t>
       </w:r>
       <w:r>
-        <w:t>abre la app y toca "Instalar" (o el menú ⋮ › Instalar app). También puedes ir a Ajustes › Instalar en este teléfono.</w:t>
+        <w:rPr/>
+        <w:t>Abre https://lfzv98.github.io/la-fructosa/ en Chrome. Toca "Instalar" en el aviso, o el menú ⋮ › "Instalar app" (o "Agregar a pantalla principal").</w:t>
       </w:r>
     </w:p>
     <w:p>
@@ -2511,7 +2800,389 @@
         <w:pStyle w:val="Heading1"/>
       </w:pPr>
       <w:r>
-        <w:t>20. Preguntas frecuentes</w:t>
+        <w:rPr/>
+        <w:t>20. Conciliación semanal</w:t>
+      </w:r>
+    </w:p>
+    <w:p>
+      <w:pPr>
+        <w:spacing w:after="120"/>
+      </w:pPr>
+      <w:r>
+        <w:rPr/>
+        <w:t>Conciliar es comparar el saldo de la app con el de tu banco o tu cartera y corregir la diferencia. Hazlo una vez por semana (por ejemplo, cada domingo) y tu patrimonio siempre será real.</w:t>
+      </w:r>
+    </w:p>
+    <w:p>
+      <w:pPr>
+        <w:spacing w:after="60"/>
+        <w:ind w:left="510" w:hanging="283"/>
+      </w:pPr>
+      <w:r>
+        <w:rPr>
+          <w:b/>
+          <w:color w:val="3E63B8"/>
+        </w:rPr>
+        <w:t xml:space="preserve">1.  </w:t>
+      </w:r>
+      <w:r>
+        <w:rPr/>
+        <w:t>Abre la app de tu banco (o cuenta el efectivo) y anota el saldo real de cada cuenta.</w:t>
+      </w:r>
+    </w:p>
+    <w:p>
+      <w:pPr>
+        <w:spacing w:after="60"/>
+        <w:ind w:left="510" w:hanging="283"/>
+      </w:pPr>
+      <w:r>
+        <w:rPr>
+          <w:b/>
+          <w:color w:val="3E63B8"/>
+        </w:rPr>
+        <w:t xml:space="preserve">2.  </w:t>
+      </w:r>
+      <w:r>
+        <w:rPr/>
+        <w:t>En La Fructosa entra a Más › Cuentas y toca la cuenta.</w:t>
+      </w:r>
+    </w:p>
+    <w:p>
+      <w:pPr>
+        <w:spacing w:after="60"/>
+        <w:ind w:left="510" w:hanging="283"/>
+      </w:pPr>
+      <w:r>
+        <w:rPr>
+          <w:b/>
+          <w:color w:val="3E63B8"/>
+        </w:rPr>
+        <w:t xml:space="preserve">3.  </w:t>
+      </w:r>
+      <w:r>
+        <w:rPr/>
+        <w:t>Si el saldo coincide, listo. Si no, revisa en su lista de movimientos si te faltó anotar algo (una comisión, un Pago Móvil, una compra pequeña) y regístralo.</w:t>
+      </w:r>
+    </w:p>
+    <w:p>
+      <w:pPr>
+        <w:spacing w:after="60"/>
+        <w:ind w:left="510" w:hanging="283"/>
+      </w:pPr>
+      <w:r>
+        <w:rPr>
+          <w:b/>
+          <w:color w:val="3E63B8"/>
+        </w:rPr>
+        <w:t xml:space="preserve">4.  </w:t>
+      </w:r>
+      <w:r>
+        <w:rPr/>
+        <w:t>Si aún hay diferencia, toca "Ajustar", escribe el saldo real y confirma. La app registra la diferencia como "Ajuste de saldo".</w:t>
+      </w:r>
+    </w:p>
+    <w:p>
+      <w:pPr>
+        <w:spacing w:after="60"/>
+        <w:ind w:left="510" w:hanging="283"/>
+      </w:pPr>
+      <w:r>
+        <w:rPr>
+          <w:b/>
+          <w:color w:val="3E63B8"/>
+        </w:rPr>
+        <w:t xml:space="preserve">5.  </w:t>
+      </w:r>
+      <w:r>
+        <w:rPr/>
+        <w:t>Repite con cada cuenta y termina en Análisis para ver cómo va el mes.</w:t>
+      </w:r>
+    </w:p>
+    <w:p>
+      <w:pPr>
+        <w:pStyle w:val="ListBullet"/>
+        <w:spacing w:after="60"/>
+      </w:pPr>
+      <w:r>
+        <w:rPr/>
+        <w:t>Un ajuste grande o frecuente es una señal: hay gastos que se te escapan. Anótalos al momento la semana siguiente.</w:t>
+      </w:r>
+    </w:p>
+    <w:p>
+      <w:pPr>
+        <w:pStyle w:val="ListBullet"/>
+        <w:spacing w:after="60"/>
+      </w:pPr>
+      <w:r>
+        <w:rPr/>
+        <w:t>Las comisiones bancarias y de cambio cuentan: anótalas como gasto para que el saldo cuadre.</w:t>
+      </w:r>
+    </w:p>
+    <w:p>
+      <w:pPr>
+        <w:pStyle w:val="Heading1"/>
+      </w:pPr>
+      <w:r>
+        <w:rPr/>
+        <w:t>21. Exportar tus datos: Excel y CSV</w:t>
+      </w:r>
+    </w:p>
+    <w:p>
+      <w:pPr>
+        <w:spacing w:after="120"/>
+      </w:pPr>
+      <w:r>
+        <w:rPr/>
+        <w:t>Tus datos son tuyos y puedes llevártelos cuando quieras para tu control local.</w:t>
+      </w:r>
+    </w:p>
+    <w:p>
+      <w:pPr>
+        <w:spacing w:after="60"/>
+        <w:ind w:left="510" w:hanging="283"/>
+      </w:pPr>
+      <w:r>
+        <w:rPr>
+          <w:b/>
+          <w:color w:val="3E63B8"/>
+        </w:rPr>
+        <w:t xml:space="preserve">1.  </w:t>
+      </w:r>
+      <w:r>
+        <w:rPr/>
+        <w:t>Respaldo completo en Excel: Más › Ajustes › Respaldo › "Descargar todos mis datos (Excel)". Trae resumen, cuentas, movimientos, presupuestos, pagos fijos, metas, préstamos y tasas.</w:t>
+      </w:r>
+    </w:p>
+    <w:p>
+      <w:pPr>
+        <w:spacing w:after="60"/>
+        <w:ind w:left="510" w:hanging="283"/>
+      </w:pPr>
+      <w:r>
+        <w:rPr>
+          <w:b/>
+          <w:color w:val="3E63B8"/>
+        </w:rPr>
+        <w:t xml:space="preserve">2.  </w:t>
+      </w:r>
+      <w:r>
+        <w:rPr/>
+        <w:t>Movimientos en CSV: en Movimientos filtra lo que quieras (mes, cuenta, categoría) y toca el ícono de descarga ⬇️. En Análisis, el mismo ícono exporta el mes que estás viendo.</w:t>
+      </w:r>
+    </w:p>
+    <w:p>
+      <w:pPr>
+        <w:spacing w:after="60"/>
+        <w:ind w:left="510" w:hanging="283"/>
+      </w:pPr>
+      <w:r>
+        <w:rPr>
+          <w:b/>
+          <w:color w:val="3E63B8"/>
+        </w:rPr>
+        <w:t xml:space="preserve">3.  </w:t>
+      </w:r>
+      <w:r>
+        <w:rPr/>
+        <w:t>En iPhone, cuando aparezca el menú de compartir, toca "Guardar en Archivos" y elige una carpeta (iCloud Drive o En mi iPhone). En computadora se descarga directo.</w:t>
+      </w:r>
+    </w:p>
+    <w:p>
+      <w:pPr>
+        <w:spacing w:after="60"/>
+        <w:ind w:left="510" w:hanging="283"/>
+      </w:pPr>
+      <w:r>
+        <w:rPr>
+          <w:b/>
+          <w:color w:val="3E63B8"/>
+        </w:rPr>
+        <w:t xml:space="preserve">4.  </w:t>
+      </w:r>
+      <w:r>
+        <w:rPr/>
+        <w:t>Abre el archivo en Excel, Numbers o Google Sheets. El CSV viene separado por punto y coma, con acentos y montos listos para Excel en español.</w:t>
+      </w:r>
+    </w:p>
+    <w:p>
+      <w:pPr>
+        <w:pStyle w:val="ListBullet"/>
+        <w:spacing w:after="60"/>
+      </w:pPr>
+      <w:r>
+        <w:rPr/>
+        <w:t>Haz tu respaldo cada semana, después de conciliar. Si pasan 7 días sin respaldo, la app te lo recuerda.</w:t>
+      </w:r>
+    </w:p>
+    <w:p>
+      <w:pPr>
+        <w:pStyle w:val="Heading1"/>
+      </w:pPr>
+      <w:r>
+        <w:rPr/>
+        <w:t>22. Guía de finanzas personales</w:t>
+      </w:r>
+    </w:p>
+    <w:p>
+      <w:pPr>
+        <w:spacing w:after="120"/>
+      </w:pPr>
+      <w:r>
+        <w:rPr/>
+        <w:t>«Lo que no se mide, no se controla ni se mejora.» La Fructosa funciona como un sistema: registrar, conciliar, revisar y ahorrar. Si sigues estos hábitos durante un mes, vas a saber exactamente a dónde va tu dinero y qué cambiar.</w:t>
+      </w:r>
+    </w:p>
+    <w:p>
+      <w:pPr>
+        <w:pStyle w:val="ListBullet"/>
+        <w:spacing w:after="60"/>
+      </w:pPr>
+      <w:r>
+        <w:rPr>
+          <w:b/>
+        </w:rPr>
+        <w:t xml:space="preserve">📏 La regla de oro: mide todo. </w:t>
+      </w:r>
+      <w:r>
+        <w:rPr/>
+        <w:t>No puedes mejorar lo que no ves. Anota cada gasto, por pequeño que sea: el café, el estacionamiento, la comisión del banco. Los gastos "hormiga" suelen sumar entre el 10% y el 20% del mes.</w:t>
+      </w:r>
+    </w:p>
+    <w:p>
+      <w:pPr>
+        <w:pStyle w:val="ListBullet"/>
+        <w:spacing w:after="60"/>
+      </w:pPr>
+      <w:r>
+        <w:rPr>
+          <w:b/>
+        </w:rPr>
+        <w:t xml:space="preserve">⚡ Registra al momento. </w:t>
+      </w:r>
+      <w:r>
+        <w:rPr/>
+        <w:t>Anota el gasto apenas pagues, en los siguientes diez segundos. Con Fructosa basta una nota de voz o la captura del comprobante. No dejes acumular capturas: después de dos días ya no recuerdas la mitad.</w:t>
+      </w:r>
+    </w:p>
+    <w:p>
+      <w:pPr>
+        <w:pStyle w:val="ListBullet"/>
+        <w:spacing w:after="60"/>
+      </w:pPr>
+      <w:r>
+        <w:rPr>
+          <w:b/>
+        </w:rPr>
+        <w:t xml:space="preserve">⚖️ Concilia cada semana. </w:t>
+      </w:r>
+      <w:r>
+        <w:rPr/>
+        <w:t>Elige un día fijo (domingo funciona bien) y compara el saldo de cada cuenta con el real. Quince minutos a la semana mantienen tu patrimonio exacto y te avisan de fugas a tiempo.</w:t>
+      </w:r>
+    </w:p>
+    <w:p>
+      <w:pPr>
+        <w:pStyle w:val="ListBullet"/>
+        <w:spacing w:after="60"/>
+      </w:pPr>
+      <w:r>
+        <w:rPr>
+          <w:b/>
+        </w:rPr>
+        <w:t xml:space="preserve">🛟 Fondo de emergencia primero. </w:t>
+      </w:r>
+      <w:r>
+        <w:rPr/>
+        <w:t>Antes de invertir o hacer compras grandes, junta entre 3 y 6 meses de tus gastos básicos en una cuenta aparte, en una moneda estable (USD o USDT). Créalo como Meta de ahorro y abónale cada mes.</w:t>
+      </w:r>
+    </w:p>
+    <w:p>
+      <w:pPr>
+        <w:pStyle w:val="ListBullet"/>
+        <w:spacing w:after="60"/>
+      </w:pPr>
+      <w:r>
+        <w:rPr>
+          <w:b/>
+        </w:rPr>
+        <w:t xml:space="preserve">🏁 Metas de ahorro con fecha. </w:t>
+      </w:r>
+      <w:r>
+        <w:rPr/>
+        <w:t>Una meta sin fecha es un deseo. Ponle monto y fecha en Más › Metas de ahorro y la app te dice cuánto apartar cada mes. Págate primero: cuando cobres, aparta el ahorro antes de gastar.</w:t>
+      </w:r>
+    </w:p>
+    <w:p>
+      <w:pPr>
+        <w:pStyle w:val="ListBullet"/>
+        <w:spacing w:after="60"/>
+      </w:pPr>
+      <w:r>
+        <w:rPr>
+          <w:b/>
+        </w:rPr>
+        <w:t xml:space="preserve">🧮 Reparte con la regla 50/30/20. </w:t>
+      </w:r>
+      <w:r>
+        <w:rPr/>
+        <w:t>50% para necesidades (mercado, servicios, alquiler), 30% para gustos y 20% para ahorro y deudas. Ponle un presupuesto a las categorías donde más se te va el dinero.</w:t>
+      </w:r>
+    </w:p>
+    <w:p>
+      <w:pPr>
+        <w:pStyle w:val="ListBullet"/>
+        <w:spacing w:after="60"/>
+      </w:pPr>
+      <w:r>
+        <w:rPr>
+          <w:b/>
+        </w:rPr>
+        <w:t xml:space="preserve">💱 Cuida la brecha. </w:t>
+      </w:r>
+      <w:r>
+        <w:rPr/>
+        <w:t>Si pagas en bolívares con respaldo en divisas, compara antes en Tasas si te conviene pagar en dólares o cambiar. La app te muestra cada mes cuánto te ahorró o te costó.</w:t>
+      </w:r>
+    </w:p>
+    <w:p>
+      <w:pPr>
+        <w:pStyle w:val="ListBullet"/>
+        <w:spacing w:after="60"/>
+      </w:pPr>
+      <w:r>
+        <w:rPr>
+          <w:b/>
+        </w:rPr>
+        <w:t xml:space="preserve">📅 Revisa el mes los lunes. </w:t>
+      </w:r>
+      <w:r>
+        <w:rPr/>
+        <w:t>Abre Análisis, mira tus tres categorías más altas y compáralas con el mes anterior. Decide un solo ajuste para la semana: es más fácil cumplir uno que diez.</w:t>
+      </w:r>
+    </w:p>
+    <w:p>
+      <w:pPr>
+        <w:pStyle w:val="ListBullet"/>
+        <w:spacing w:after="60"/>
+      </w:pPr>
+      <w:r>
+        <w:rPr>
+          <w:b/>
+        </w:rPr>
+        <w:t xml:space="preserve">Tu rutina: </w:t>
+      </w:r>
+      <w:r>
+        <w:rPr/>
+        <w:t>Cada día: registra al momento (voz, captura o +). · Cada domingo: concilia tus cuentas y descarga tu respaldo. · Cada lunes: revisa Análisis y tus presupuestos. · Cada mes: abona a tu fondo de emergencia y a tus metas.</w:t>
+      </w:r>
+    </w:p>
+    <w:p>
+      <w:pPr>
+        <w:pStyle w:val="Heading1"/>
+      </w:pPr>
+      <w:r>
+        <w:rPr/>
+        <w:t>23. Preguntas frecuentes</w:t>
       </w:r>
     </w:p>
     <w:p>

</xml_diff>